<commit_message>
heat maps + VWC changes
</commit_message>
<xml_diff>
--- a/report_template.docx
+++ b/report_template.docx
@@ -1740,56 +1740,6 @@
         </w:rPr>
         <w:lastRenderedPageBreak/>
         <w:t>3. RESULTS FOR PITCH</w:t>
-      </w:r>
-    </w:p>
-    <w:p>
-      <w:r>
-        <w:t xml:space="preserve">{#has_shear}</w:t>
-      </w:r>
-    </w:p>
-    <w:p>
-      <w:pPr>
-        <w:spacing w:before="160" w:after="40"/>
-        <w:jc w:val="center"/>
-        <w:rPr>
-          <w:rFonts w:ascii="Arial" w:hAnsi="Arial" w:cs="Arial"/>
-          <w:noProof/>
-          <w:lang w:val="en-GB"/>
-        </w:rPr>
-      </w:pPr>
-      <w:r>
-        <w:rPr>
-          <w:rFonts w:ascii="Arial" w:hAnsi="Arial" w:cs="Arial"/>
-          <w:noProof/>
-          <w:lang w:val="en-GB"/>
-        </w:rPr>
-        <w:t>{%map_shear}</w:t>
-      </w:r>
-    </w:p>
-    <w:p>
-      <w:pPr>
-        <w:spacing w:after="240"/>
-        <w:jc w:val="center"/>
-        <w:rPr>
-          <w:rFonts w:ascii="Arial" w:hAnsi="Arial" w:cs="Arial"/>
-          <w:i/>
-          <w:iCs/>
-          <w:lang w:val="en-GB"/>
-        </w:rPr>
-      </w:pPr>
-      <w:r>
-        <w:rPr>
-          <w:rFonts w:ascii="Arial" w:hAnsi="Arial" w:cs="Arial"/>
-          <w:i/>
-          <w:iCs/>
-          <w:lang w:val="en-GB"/>
-        </w:rPr>
-        <w:t>{cap_shear}</w:t>
-      </w:r>
-    </w:p>
-    <w:p>
-      <w:r>
-        <w:t xml:space="preserve">{/has_shear}</w:t>
       </w:r>
     </w:p>
     <w:p>
@@ -1893,6 +1843,56 @@
       </w:r>
     </w:p>
     <w:p>
+      <w:r>
+        <w:t xml:space="preserve">{#has_moisture76}</w:t>
+      </w:r>
+    </w:p>
+    <w:p>
+      <w:pPr>
+        <w:spacing w:before="160" w:after="40"/>
+        <w:jc w:val="center"/>
+        <w:rPr>
+          <w:rFonts w:ascii="Arial" w:hAnsi="Arial" w:cs="Arial"/>
+          <w:noProof/>
+          <w:lang w:val="en-GB"/>
+        </w:rPr>
+      </w:pPr>
+      <w:r>
+        <w:rPr>
+          <w:rFonts w:ascii="Arial" w:hAnsi="Arial" w:cs="Arial"/>
+          <w:noProof/>
+          <w:lang w:val="en-GB"/>
+        </w:rPr>
+        <w:t>{%map_moisture76}</w:t>
+      </w:r>
+    </w:p>
+    <w:p>
+      <w:pPr>
+        <w:spacing w:after="240"/>
+        <w:jc w:val="center"/>
+        <w:rPr>
+          <w:rFonts w:ascii="Arial" w:hAnsi="Arial" w:cs="Arial"/>
+          <w:i/>
+          <w:iCs/>
+          <w:lang w:val="en-GB"/>
+        </w:rPr>
+      </w:pPr>
+      <w:r>
+        <w:rPr>
+          <w:rFonts w:ascii="Arial" w:hAnsi="Arial" w:cs="Arial"/>
+          <w:i/>
+          <w:iCs/>
+          <w:lang w:val="en-GB"/>
+        </w:rPr>
+        <w:t>{cap_moisture76}</w:t>
+      </w:r>
+    </w:p>
+    <w:p>
+      <w:r>
+        <w:t xml:space="preserve">{/has_moisture76}</w:t>
+      </w:r>
+    </w:p>
+    <w:p>
       <w:pPr>
         <w:pStyle w:val="Heading2"/>
         <w:pageBreakBefore/>
@@ -6764,7 +6764,7 @@
                 <w:rFonts w:ascii="Arial" w:hAnsi="Arial" w:cs="Arial"/>
                 <w:lang w:val="en-GB"/>
               </w:rPr>
-              <w:t>Soil Moisture Content — 38 mm (1.5 in)</w:t>
+              <w:t>{#moisture_rows}{label}</w:t>
             </w:r>
           </w:p>
         </w:tc>
@@ -6792,7 +6792,7 @@
               <w:rPr>
                 <w:rFonts w:ascii="Arial" w:hAnsi="Arial" w:cs="Arial"/>
               </w:rPr>
-              <w:t>{res_moisture_avg}</w:t>
+              <w:t>{avg}</w:t>
             </w:r>
           </w:p>
         </w:tc>
@@ -6820,7 +6820,7 @@
               <w:rPr>
                 <w:rFonts w:ascii="Arial" w:hAnsi="Arial" w:cs="Arial"/>
               </w:rPr>
-              <w:t>{res_moisture_var}</w:t>
+              <w:t>{var}</w:t>
             </w:r>
           </w:p>
         </w:tc>
@@ -6846,122 +6846,7 @@
               <w:rPr>
                 <w:rFonts w:ascii="Arial" w:hAnsi="Arial" w:cs="Arial"/>
               </w:rPr>
-              <w:t>{res_moisture_cmt}</w:t>
-            </w:r>
-          </w:p>
-        </w:tc>
-      </w:tr>
-      <w:tr>
-        <w:trPr>
-          <w:trHeight w:val="718"/>
-        </w:trPr>
-        <w:tc>
-          <w:tcPr>
-            <w:tcW w:w="1793" w:type="dxa"/>
-            <w:tcBorders>
-              <w:top w:val="single" w:sz="4" w:space="0" w:color="auto"/>
-              <w:left w:val="single" w:sz="4" w:space="0" w:color="auto"/>
-              <w:bottom w:val="single" w:sz="4" w:space="0" w:color="auto"/>
-              <w:right w:val="single" w:sz="4" w:space="0" w:color="auto"/>
-            </w:tcBorders>
-            <w:vAlign w:val="center"/>
-          </w:tcPr>
-          <w:p>
-            <w:pPr>
-              <w:pStyle w:val="Heading2"/>
-              <w:rPr>
-                <w:rFonts w:ascii="Arial" w:hAnsi="Arial" w:cs="Arial"/>
-                <w:lang w:val="en-GB"/>
-              </w:rPr>
-            </w:pPr>
-            <w:r>
-              <w:rPr>
-                <w:rFonts w:ascii="Arial" w:hAnsi="Arial" w:cs="Arial"/>
-                <w:lang w:val="en-GB"/>
-              </w:rPr>
-              <w:t>Soil Moisture Content — 76 mm (3 in)</w:t>
-            </w:r>
-          </w:p>
-        </w:tc>
-        <w:tc>
-          <w:tcPr>
-            <w:tcW w:w="2551" w:type="dxa"/>
-            <w:tcBorders>
-              <w:top w:val="single" w:sz="4" w:space="0" w:color="auto"/>
-              <w:left w:val="single" w:sz="4" w:space="0" w:color="auto"/>
-              <w:bottom w:val="single" w:sz="4" w:space="0" w:color="auto"/>
-              <w:right w:val="single" w:sz="4" w:space="0" w:color="auto"/>
-            </w:tcBorders>
-            <w:vAlign w:val="center"/>
-          </w:tcPr>
-          <w:p>
-            <w:pPr>
-              <w:pStyle w:val="Heading2"/>
-              <w:jc w:val="center"/>
-              <w:rPr>
-                <w:rFonts w:ascii="Arial" w:hAnsi="Arial" w:cs="Arial"/>
-                <w:lang w:val="en-GB"/>
-              </w:rPr>
-            </w:pPr>
-            <w:r>
-              <w:rPr>
-                <w:rFonts w:ascii="Arial" w:hAnsi="Arial" w:cs="Arial"/>
-              </w:rPr>
-              <w:t>{res_moisture76_avg}</w:t>
-            </w:r>
-          </w:p>
-        </w:tc>
-        <w:tc>
-          <w:tcPr>
-            <w:tcW w:w="2498" w:type="dxa"/>
-            <w:tcBorders>
-              <w:top w:val="single" w:sz="4" w:space="0" w:color="auto"/>
-              <w:left w:val="single" w:sz="4" w:space="0" w:color="auto"/>
-              <w:bottom w:val="single" w:sz="4" w:space="0" w:color="auto"/>
-              <w:right w:val="single" w:sz="4" w:space="0" w:color="auto"/>
-            </w:tcBorders>
-            <w:vAlign w:val="center"/>
-          </w:tcPr>
-          <w:p>
-            <w:pPr>
-              <w:pStyle w:val="Heading2"/>
-              <w:jc w:val="center"/>
-              <w:rPr>
-                <w:rFonts w:ascii="Arial" w:hAnsi="Arial" w:cs="Arial"/>
-                <w:lang w:val="en-GB"/>
-              </w:rPr>
-            </w:pPr>
-            <w:r>
-              <w:rPr>
-                <w:rFonts w:ascii="Arial" w:hAnsi="Arial" w:cs="Arial"/>
-              </w:rPr>
-              <w:t>{res_moisture76_var}</w:t>
-            </w:r>
-          </w:p>
-        </w:tc>
-        <w:tc>
-          <w:tcPr>
-            <w:tcW w:w="2651" w:type="dxa"/>
-            <w:tcBorders>
-              <w:top w:val="single" w:sz="4" w:space="0" w:color="auto"/>
-              <w:left w:val="single" w:sz="4" w:space="0" w:color="auto"/>
-              <w:bottom w:val="single" w:sz="4" w:space="0" w:color="auto"/>
-              <w:right w:val="single" w:sz="4" w:space="0" w:color="auto"/>
-            </w:tcBorders>
-            <w:vAlign w:val="center"/>
-          </w:tcPr>
-          <w:p>
-            <w:pPr>
-              <w:rPr>
-                <w:rFonts w:ascii="Arial" w:hAnsi="Arial" w:cs="Arial"/>
-                <w:lang w:val="en-GB"/>
-              </w:rPr>
-            </w:pPr>
-            <w:r>
-              <w:rPr>
-                <w:rFonts w:ascii="Arial" w:hAnsi="Arial" w:cs="Arial"/>
-              </w:rPr>
-              <w:t>{res_moisture76_cmt}</w:t>
+              <w:t>{cmt}{/moisture_rows}</w:t>
             </w:r>
           </w:p>
         </w:tc>

</xml_diff>